<commit_message>
Actualiza manuales, video y evidencias para MESSI 0.4.0
</commit_message>
<xml_diff>
--- a/docs/entrega_2/02_Manual_del_programador.docx
+++ b/docs/entrega_2/02_Manual_del_programador.docx
@@ -32,7 +32,7 @@
           <w:sz w:val="22"/>
           <w:szCs w:val="22"/>
         </w:rPr>
-        <w:t>Entrega 2 · MESSI 0.3.0 para Windows</w:t>
+        <w:t>Entrega 2 · MESSI 0.4.0 para Windows</w:t>
       </w:r>
     </w:p>
     <w:tbl>
@@ -477,7 +477,7 @@
                 <w:sz w:val="19"/>
                 <w:szCs w:val="19"/>
               </w:rPr>
-              <w:t>1.0 · Aplicación 0.3.0</w:t>
+              <w:t>1.1 · Aplicación 0.4.0</w:t>
             </w:r>
           </w:p>
         </w:tc>
@@ -534,7 +534,7 @@
           <w:sz w:val="19"/>
           <w:szCs w:val="19"/>
         </w:rPr>
-        <w:t>El ejecutable abre una ventana de control y un servidor en 127.0.0.1; la interfaz se usa en el navegador de la misma computadora. El instalador incluye el entorno y los recursos.</w:t>
+        <w:t>El ejecutable abre una ventana de control y un servidor en 127.0.0.1; la interfaz se usa en el navegador de la misma computadora. presentation.py organiza las vistas, el progreso y los rótulos sin cambiar los registros. El instalador incluye el entorno y los recursos.</w:t>
       </w:r>
     </w:p>
     <w:tbl>
@@ -1274,6 +1274,320 @@
                 <w:color w:val="222222"/>
                 <w:sz w:val="19"/>
               </w:rPr>
+              <w:t>messi/presentation.py</w:t>
+            </w:r>
+          </w:p>
+        </w:tc>
+        <w:tc>
+          <w:tcPr>
+            <w:tcW w:w="1716" w:type="dxa"/>
+            <w:tcBorders>
+              <w:top w:val="single" w:sz="4" w:space="0" w:color="BFBFBF"/>
+              <w:left w:val="single" w:sz="4" w:space="0" w:color="BFBFBF"/>
+              <w:bottom w:val="single" w:sz="4" w:space="0" w:color="BFBFBF"/>
+              <w:right w:val="single" w:sz="4" w:space="0" w:color="BFBFBF"/>
+            </w:tcBorders>
+            <w:tcMar>
+              <w:top w:w="70" w:type="dxa"/>
+              <w:left w:w="100" w:type="dxa"/>
+              <w:bottom w:w="70" w:type="dxa"/>
+              <w:right w:w="100" w:type="dxa"/>
+            </w:tcMar>
+            <w:vAlign w:val="center"/>
+          </w:tcPr>
+          <w:p>
+            <w:r>
+              <w:rPr>
+                <w:b w:val="0"/>
+                <w:i w:val="0"/>
+                <w:color w:val="222222"/>
+                <w:sz w:val="19"/>
+              </w:rPr>
+              <w:t>setup_page; teacher_steps; empty_state; kicker</w:t>
+            </w:r>
+          </w:p>
+        </w:tc>
+        <w:tc>
+          <w:tcPr>
+            <w:tcW w:w="2808" w:type="dxa"/>
+            <w:tcBorders>
+              <w:top w:val="single" w:sz="4" w:space="0" w:color="BFBFBF"/>
+              <w:left w:val="single" w:sz="4" w:space="0" w:color="BFBFBF"/>
+              <w:bottom w:val="single" w:sz="4" w:space="0" w:color="BFBFBF"/>
+              <w:right w:val="single" w:sz="4" w:space="0" w:color="BFBFBF"/>
+            </w:tcBorders>
+            <w:tcMar>
+              <w:top w:w="70" w:type="dxa"/>
+              <w:left w:w="100" w:type="dxa"/>
+              <w:bottom w:w="70" w:type="dxa"/>
+              <w:right w:w="100" w:type="dxa"/>
+            </w:tcMar>
+            <w:vAlign w:val="center"/>
+          </w:tcPr>
+          <w:p>
+            <w:r>
+              <w:rPr>
+                <w:b w:val="0"/>
+                <w:i w:val="0"/>
+                <w:color w:val="222222"/>
+                <w:sz w:val="19"/>
+              </w:rPr>
+              <w:t>Presenta marca, navegación, pasos de progreso y estados vacíos con CSS local.</w:t>
+            </w:r>
+          </w:p>
+        </w:tc>
+        <w:tc>
+          <w:tcPr>
+            <w:tcW w:w="1560" w:type="dxa"/>
+            <w:tcBorders>
+              <w:top w:val="single" w:sz="4" w:space="0" w:color="BFBFBF"/>
+              <w:left w:val="single" w:sz="4" w:space="0" w:color="BFBFBF"/>
+              <w:bottom w:val="single" w:sz="4" w:space="0" w:color="BFBFBF"/>
+              <w:right w:val="single" w:sz="4" w:space="0" w:color="BFBFBF"/>
+            </w:tcBorders>
+            <w:tcMar>
+              <w:top w:w="70" w:type="dxa"/>
+              <w:left w:w="100" w:type="dxa"/>
+              <w:bottom w:w="70" w:type="dxa"/>
+              <w:right w:w="100" w:type="dxa"/>
+            </w:tcMar>
+            <w:vAlign w:val="center"/>
+          </w:tcPr>
+          <w:p>
+            <w:r>
+              <w:rPr>
+                <w:b w:val="0"/>
+                <w:i w:val="0"/>
+                <w:color w:val="222222"/>
+                <w:sz w:val="19"/>
+              </w:rPr>
+              <w:t>Streamlit y estado de sesión</w:t>
+            </w:r>
+          </w:p>
+        </w:tc>
+        <w:tc>
+          <w:tcPr>
+            <w:tcW w:w="1560" w:type="dxa"/>
+            <w:tcBorders>
+              <w:top w:val="single" w:sz="4" w:space="0" w:color="BFBFBF"/>
+              <w:left w:val="single" w:sz="4" w:space="0" w:color="BFBFBF"/>
+              <w:bottom w:val="single" w:sz="4" w:space="0" w:color="BFBFBF"/>
+              <w:right w:val="single" w:sz="4" w:space="0" w:color="BFBFBF"/>
+            </w:tcBorders>
+            <w:tcMar>
+              <w:top w:w="70" w:type="dxa"/>
+              <w:left w:w="100" w:type="dxa"/>
+              <w:bottom w:w="70" w:type="dxa"/>
+              <w:right w:w="100" w:type="dxa"/>
+            </w:tcMar>
+            <w:vAlign w:val="center"/>
+          </w:tcPr>
+          <w:p>
+            <w:r>
+              <w:rPr>
+                <w:b w:val="0"/>
+                <w:i w:val="0"/>
+                <w:color w:val="222222"/>
+                <w:sz w:val="19"/>
+              </w:rPr>
+              <w:t>Interfaz guiada</w:t>
+            </w:r>
+          </w:p>
+        </w:tc>
+      </w:tr>
+      <w:tr>
+        <w:tblPrEx>
+          <w:tblCellMar>
+            <w:top w:w="0" w:type="dxa"/>
+            <w:bottom w:w="0" w:type="dxa"/>
+          </w:tblCellMar>
+        </w:tblPrEx>
+        <w:trPr>
+          <w:cantSplit/>
+          <w:trHeight w:val="440"/>
+        </w:trPr>
+        <w:tc>
+          <w:tcPr>
+            <w:tcW w:w="1716" w:type="dxa"/>
+            <w:tcBorders>
+              <w:top w:val="single" w:sz="4" w:space="0" w:color="BFBFBF"/>
+              <w:left w:val="single" w:sz="4" w:space="0" w:color="BFBFBF"/>
+              <w:bottom w:val="single" w:sz="4" w:space="0" w:color="BFBFBF"/>
+              <w:right w:val="single" w:sz="4" w:space="0" w:color="BFBFBF"/>
+            </w:tcBorders>
+            <w:tcMar>
+              <w:top w:w="70" w:type="dxa"/>
+              <w:left w:w="100" w:type="dxa"/>
+              <w:bottom w:w="70" w:type="dxa"/>
+              <w:right w:w="100" w:type="dxa"/>
+            </w:tcMar>
+            <w:vAlign w:val="center"/>
+          </w:tcPr>
+          <w:p>
+            <w:r>
+              <w:rPr>
+                <w:b w:val="0"/>
+                <w:i w:val="0"/>
+                <w:color w:val="222222"/>
+                <w:sz w:val="19"/>
+              </w:rPr>
+              <w:t>messi/presentation.py</w:t>
+            </w:r>
+          </w:p>
+        </w:tc>
+        <w:tc>
+          <w:tcPr>
+            <w:tcW w:w="1716" w:type="dxa"/>
+            <w:tcBorders>
+              <w:top w:val="single" w:sz="4" w:space="0" w:color="BFBFBF"/>
+              <w:left w:val="single" w:sz="4" w:space="0" w:color="BFBFBF"/>
+              <w:bottom w:val="single" w:sz="4" w:space="0" w:color="BFBFBF"/>
+              <w:right w:val="single" w:sz="4" w:space="0" w:color="BFBFBF"/>
+            </w:tcBorders>
+            <w:tcMar>
+              <w:top w:w="70" w:type="dxa"/>
+              <w:left w:w="100" w:type="dxa"/>
+              <w:bottom w:w="70" w:type="dxa"/>
+              <w:right w:w="100" w:type="dxa"/>
+            </w:tcMar>
+            <w:vAlign w:val="center"/>
+          </w:tcPr>
+          <w:p>
+            <w:r>
+              <w:rPr>
+                <w:b w:val="0"/>
+                <w:i w:val="0"/>
+                <w:color w:val="222222"/>
+                <w:sz w:val="19"/>
+              </w:rPr>
+              <w:t>readable_rows; support_label</w:t>
+            </w:r>
+          </w:p>
+        </w:tc>
+        <w:tc>
+          <w:tcPr>
+            <w:tcW w:w="2808" w:type="dxa"/>
+            <w:tcBorders>
+              <w:top w:val="single" w:sz="4" w:space="0" w:color="BFBFBF"/>
+              <w:left w:val="single" w:sz="4" w:space="0" w:color="BFBFBF"/>
+              <w:bottom w:val="single" w:sz="4" w:space="0" w:color="BFBFBF"/>
+              <w:right w:val="single" w:sz="4" w:space="0" w:color="BFBFBF"/>
+            </w:tcBorders>
+            <w:tcMar>
+              <w:top w:w="70" w:type="dxa"/>
+              <w:left w:w="100" w:type="dxa"/>
+              <w:bottom w:w="70" w:type="dxa"/>
+              <w:right w:w="100" w:type="dxa"/>
+            </w:tcMar>
+            <w:vAlign w:val="center"/>
+          </w:tcPr>
+          <w:p>
+            <w:r>
+              <w:rPr>
+                <w:b w:val="0"/>
+                <w:i w:val="0"/>
+                <w:color w:val="222222"/>
+                <w:sz w:val="19"/>
+              </w:rPr>
+              <w:t>Traduce una copia de las filas, tipos de apoyo y fechas a hora local; no altera SQLite.</w:t>
+            </w:r>
+          </w:p>
+        </w:tc>
+        <w:tc>
+          <w:tcPr>
+            <w:tcW w:w="1560" w:type="dxa"/>
+            <w:tcBorders>
+              <w:top w:val="single" w:sz="4" w:space="0" w:color="BFBFBF"/>
+              <w:left w:val="single" w:sz="4" w:space="0" w:color="BFBFBF"/>
+              <w:bottom w:val="single" w:sz="4" w:space="0" w:color="BFBFBF"/>
+              <w:right w:val="single" w:sz="4" w:space="0" w:color="BFBFBF"/>
+            </w:tcBorders>
+            <w:tcMar>
+              <w:top w:w="70" w:type="dxa"/>
+              <w:left w:w="100" w:type="dxa"/>
+              <w:bottom w:w="70" w:type="dxa"/>
+              <w:right w:w="100" w:type="dxa"/>
+            </w:tcMar>
+            <w:vAlign w:val="center"/>
+          </w:tcPr>
+          <w:p>
+            <w:r>
+              <w:rPr>
+                <w:b w:val="0"/>
+                <w:i w:val="0"/>
+                <w:color w:val="222222"/>
+                <w:sz w:val="19"/>
+              </w:rPr>
+              <w:t>Filas y rótulos internos</w:t>
+            </w:r>
+          </w:p>
+        </w:tc>
+        <w:tc>
+          <w:tcPr>
+            <w:tcW w:w="1560" w:type="dxa"/>
+            <w:tcBorders>
+              <w:top w:val="single" w:sz="4" w:space="0" w:color="BFBFBF"/>
+              <w:left w:val="single" w:sz="4" w:space="0" w:color="BFBFBF"/>
+              <w:bottom w:val="single" w:sz="4" w:space="0" w:color="BFBFBF"/>
+              <w:right w:val="single" w:sz="4" w:space="0" w:color="BFBFBF"/>
+            </w:tcBorders>
+            <w:tcMar>
+              <w:top w:w="70" w:type="dxa"/>
+              <w:left w:w="100" w:type="dxa"/>
+              <w:bottom w:w="70" w:type="dxa"/>
+              <w:right w:w="100" w:type="dxa"/>
+            </w:tcMar>
+            <w:vAlign w:val="center"/>
+          </w:tcPr>
+          <w:p>
+            <w:r>
+              <w:rPr>
+                <w:b w:val="0"/>
+                <w:i w:val="0"/>
+                <w:color w:val="222222"/>
+                <w:sz w:val="19"/>
+              </w:rPr>
+              <w:t>Tablas legibles</w:t>
+            </w:r>
+          </w:p>
+        </w:tc>
+      </w:tr>
+      <w:tr>
+        <w:tblPrEx>
+          <w:tblCellMar>
+            <w:top w:w="0" w:type="dxa"/>
+            <w:bottom w:w="0" w:type="dxa"/>
+          </w:tblCellMar>
+        </w:tblPrEx>
+        <w:trPr>
+          <w:cantSplit/>
+          <w:trHeight w:val="440"/>
+        </w:trPr>
+        <w:tc>
+          <w:tcPr>
+            <w:tcW w:w="1716" w:type="dxa"/>
+            <w:tcBorders>
+              <w:top w:val="single" w:sz="4" w:space="0" w:color="BFBFBF"/>
+              <w:left w:val="single" w:sz="4" w:space="0" w:color="BFBFBF"/>
+              <w:bottom w:val="single" w:sz="4" w:space="0" w:color="BFBFBF"/>
+              <w:right w:val="single" w:sz="4" w:space="0" w:color="BFBFBF"/>
+            </w:tcBorders>
+            <w:tcMar>
+              <w:top w:w="70" w:type="dxa"/>
+              <w:left w:w="100" w:type="dxa"/>
+              <w:bottom w:w="70" w:type="dxa"/>
+              <w:right w:w="100" w:type="dxa"/>
+            </w:tcMar>
+            <w:vAlign w:val="center"/>
+          </w:tcPr>
+          <w:p>
+            <w:r>
+              <w:rPr>
+                <w:b w:val="0"/>
+                <w:i w:val="0"/>
+                <w:color w:val="222222"/>
+                <w:sz w:val="19"/>
+              </w:rPr>
               <w:t>messi/data.py</w:t>
             </w:r>
           </w:p>
@@ -5842,7 +6156,7 @@
                 <w:sz w:val="20"/>
                 <w:szCs w:val="19"/>
               </w:rPr>
-              <w:t>2. Añadir una función. Ubicar la lógica en src/messi y documentar argumentos, retorno, errores y efectos persistentes. Conectarla a app.py y agregar un caso representativo de éxito y un error pertinente en tests. Mantener solicitudes/apoyos independientes del cálculo de riesgo.</w:t>
+              <w:t>2. Añadir una función. Ubicar la lógica en src/messi y documentar argumentos, retorno, errores y efectos persistentes. Conectarla a app.py y agregar un caso representativo de éxito y un error pertinente en tests. Para cambiar la presentación, editar presentation.py; mantener los nombres internos de datos, las copias de filas y los pasos de progreso coherentes con guardado/cálculo. Mantener solicitudes/apoyos independientes del cálculo de riesgo.</w:t>
             </w:r>
           </w:p>
           <w:p>

</xml_diff>